<commit_message>
fix(thesis+cd1): correct P3/P4 labeling, China TP attribution, and SIDS placeholder
- thesis/00_optimal_plan_vi.md: swap P3 (Vietnam/JABS) and P4 (Singapore/MIR) labels in paper status table
- thesis/16_cd1_part3_cases_conclusion_vi.md: fix China turning-point attribution to P5 (not P3/P4); add P3 Vietnam TP range (39–46% FSTS)
- chuyen_de/cd1/00_cd1_ctu_final_vi.md: replace 'SIDS TBD' column header with 'SIDS Thái Bình Dương' in Bảng 2.3.7.1
- dist/: updated Word exports to match latest markdown sources
- thesis/p6_scripts/p6_funnel_plot.png: add P6 meta-analysis funnel plot from R metafor output

https://claude.ai/code/session_01GMFmEtt6FYiJ4MKzBNCLqb
</commit_message>
<xml_diff>
--- a/dist/manuscripts/en/p3_vietnam_en_clean.docx
+++ b/dist/manuscripts/en/p3_vietnam_en_clean.docx
@@ -152,7 +152,7 @@
         <w:pStyle w:val="BodyText"/>
       </w:pPr>
       <w:r>
-        <w:t xml:space="preserve">Originality/value — The study shows that the conventional inverted-U in zero-inflated emerging-market settings reflects a performance gap at the export-participation barrier rather than a continuous intensity-saturation curve, and demonstrates that pooled digital coefficients on a Tier-1 binary mask progressive proxy obsolescence.</w:t>
+        <w:t xml:space="preserve">Originality/value — The study shows that the conventional inverted-U in zero-inflated emerging-market settings reflects a performance gap at the export-participation barrier rather than a continuous intensity-saturation curve, and shows that pooled digital coefficients on a Tier-1 binary mask progressive proxy obsolescence.</w:t>
       </w:r>
     </w:p>
     <w:p>
@@ -3419,13 +3419,13 @@
         <w:pStyle w:val="BodyText"/>
       </w:pPr>
       <w:r>
-        <w:t xml:space="preserve">× DAI_z = -0.912, p = .043), the quadratic interaction is positive and marginal (FSTS_c2 ×</w:t>
-      </w:r>
-      <w:r>
-        <w:t xml:space="preserve"> </w:t>
-      </w:r>
-      <w:r>
-        <w:t xml:space="preserve">DAI_z = 1.043, p = .099), and the joint test sits at marginal significance (M4 joint p = .102;</w:t>
+        <w:t xml:space="preserve">× DAI_z = -0.912, p = .043), the quadratic interaction is positive but does not reach conventional significance (FSTS_c2 ×</w:t>
+      </w:r>
+      <w:r>
+        <w:t xml:space="preserve"> </w:t>
+      </w:r>
+      <w:r>
+        <w:t xml:space="preserve">DAI_z = 1.043, p = .099), and the joint test is above the .05 threshold (M4 joint p = .102;</w:t>
       </w:r>
     </w:p>
     <w:p>
@@ -3835,7 +3835,7 @@
         <w:pStyle w:val="BodyText"/>
       </w:pPr>
       <w:r>
-        <w:t xml:space="preserve">.276). The joint Wald test sits at marginal significance (M8 joint p = .083). This pooled signal</w:t>
+        <w:t xml:space="preserve">.276). The joint Wald test does not reach conventional significance (M8 joint p = .083). This pooled signal</w:t>
       </w:r>
       <w:r>
         <w:t xml:space="preserve"> </w:t>
@@ -3847,7 +3847,7 @@
         <w:t xml:space="preserve"> </w:t>
       </w:r>
       <w:r>
-        <w:t xml:space="preserve">.825) and 2015 (p = .125), and reaches marginal significance only in 2023 (M4 joint p = .102;</w:t>
+        <w:t xml:space="preserve">.825) and 2015 (p = .125), and remains above the .05 threshold in 2023 (M4 joint p = .102;</w:t>
       </w:r>
       <w:r>
         <w:t xml:space="preserve"> </w:t>
@@ -4197,7 +4197,7 @@
         <w:t xml:space="preserve"> </w:t>
       </w:r>
       <w:r>
-        <w:t xml:space="preserve">is also at marginal significance, driven by the 2023 wave rather than by a stable</w:t>
+        <w:t xml:space="preserve">is also above the .05 threshold (p = .083), driven by the 2023 wave rather than by a stable</w:t>
       </w:r>
       <w:r>
         <w:t xml:space="preserve"> </w:t>

</xml_diff>

<commit_message>
fix(p3): correct Haans ref title + rebuild dist/JABS with figures
1. Reference title: "inverted-U-shaped" → "inverted U-shaped" to match
   canonical form in thesis/04_references_apa7.md and P4/P5/P7/P8.

2. dist/p3_vietnam_en_clean.docx: rebuilt from p3/ dir with
   --resource-path=. so figures/vietnam/*.png resolve correctly;
   file grows from ~66KB (no figures) to 1.6MB (6 figures included).

3. jabs_package/01_manuscript_blinded.docx: same fix — was also
   missing figures; rebuilt from p3/ dir, now 1.6MB.

4. build_ctu_docx.sh: fixed P3 section — was marked "no inline figures"
   and run from repo root; now runs from p3/ dir with --resource-path=.
   matching the pattern used for P4 and P5.

https://claude.ai/code/session_01GMFmEtt6FYiJ4MKzBNCLqb
</commit_message>
<xml_diff>
--- a/dist/manuscripts/en/p3_vietnam_en_clean.docx
+++ b/dist/manuscripts/en/p3_vietnam_en_clean.docx
@@ -2,7 +2,7 @@
 <file path=word/document.xml><?xml version="1.0" encoding="utf-8"?>
 <w:document xmlns:w="http://schemas.openxmlformats.org/wordprocessingml/2006/main" xmlns:m="http://schemas.openxmlformats.org/officeDocument/2006/math" xmlns:r="http://schemas.openxmlformats.org/officeDocument/2006/relationships" xmlns:o="urn:schemas-microsoft-com:office:office" xmlns:v="urn:schemas-microsoft-com:vml" xmlns:w10="urn:schemas-microsoft-com:office:word" xmlns:a="http://schemas.openxmlformats.org/drawingml/2006/main" xmlns:pic="http://schemas.openxmlformats.org/drawingml/2006/picture" xmlns:wp="http://schemas.openxmlformats.org/drawingml/2006/wordprocessingDrawing">
   <w:body>
-    <w:bookmarkStart w:id="114" w:name="X0264dbef037d515bdd41c0931e5e2e7c8717b18"/>
+    <w:bookmarkStart w:id="132" w:name="X0264dbef037d515bdd41c0931e5e2e7c8717b18"/>
     <w:p>
       <w:pPr>
         <w:pStyle w:val="Heading1"/>
@@ -967,7 +967,7 @@
     </w:p>
     <w:bookmarkEnd w:id="29"/>
     <w:bookmarkEnd w:id="30"/>
-    <w:bookmarkStart w:id="35" w:name="X8bf20a63f0decf7b16e99d564b9958ec4fbbb23"/>
+    <w:bookmarkStart w:id="38" w:name="X8bf20a63f0decf7b16e99d564b9958ec4fbbb23"/>
     <w:p>
       <w:pPr>
         <w:pStyle w:val="Heading2"/>
@@ -1632,7 +1632,7 @@
       </w:r>
     </w:p>
     <w:bookmarkEnd w:id="33"/>
-    <w:bookmarkStart w:id="34" w:name="Xa301591a4bdc42129e76c2a2b73514232150381"/>
+    <w:bookmarkStart w:id="37" w:name="Xa301591a4bdc42129e76c2a2b73514232150381"/>
     <w:p>
       <w:pPr>
         <w:pStyle w:val="Heading3"/>
@@ -1976,7 +1976,46 @@
         <w:pStyle w:val="BodyText"/>
       </w:pPr>
       <w:r>
-        <w:t xml:space="preserve">Figure 1: Conceptual model — TCI, DAI, and export intensity as determinants of firm performance (Vietnam, 3-wave)</w:t>
+        <w:drawing>
+          <wp:inline>
+            <wp:extent cx="5753100" cy="4221138"/>
+            <wp:effectExtent b="0" l="0" r="0" t="0"/>
+            <wp:docPr descr="Figure 1: Conceptual model — TCI, DAI, and export intensity as determinants of firm performance (Vietnam, 3-wave)" title="" id="35" name="Picture"/>
+            <a:graphic>
+              <a:graphicData uri="http://schemas.openxmlformats.org/drawingml/2006/picture">
+                <pic:pic>
+                  <pic:nvPicPr>
+                    <pic:cNvPr descr="figures/vietnam/figure_1_conceptual_model.png" id="36" name="Picture"/>
+                    <pic:cNvPicPr>
+                      <a:picLocks noChangeArrowheads="1" noChangeAspect="1"/>
+                    </pic:cNvPicPr>
+                  </pic:nvPicPr>
+                  <pic:blipFill>
+                    <a:blip r:embed="rId34"/>
+                    <a:stretch>
+                      <a:fillRect/>
+                    </a:stretch>
+                  </pic:blipFill>
+                  <pic:spPr bwMode="auto">
+                    <a:xfrm>
+                      <a:off x="0" y="0"/>
+                      <a:ext cx="5753100" cy="4221138"/>
+                    </a:xfrm>
+                    <a:prstGeom prst="rect">
+                      <a:avLst/>
+                    </a:prstGeom>
+                    <a:noFill/>
+                    <a:ln w="9525">
+                      <a:noFill/>
+                      <a:headEnd/>
+                      <a:tailEnd/>
+                    </a:ln>
+                  </pic:spPr>
+                </pic:pic>
+              </a:graphicData>
+            </a:graphic>
+          </wp:inline>
+        </w:drawing>
       </w:r>
     </w:p>
     <w:p>
@@ -2015,9 +2054,9 @@
         <w:t xml:space="preserve">Solid arrows represent hypothesised direct and curvilinear effects. Dashed arrows represent moderating effects. The independent variable — internationalisation intensity (FSTS, centred FSTS_c and FSTS_c²) — is placed at left; the dependent variable — firm performance, measured as ln(labour productivity) = ln(annual revenue PPP / permanent workers) — is placed at right, following left-to-right causal flow convention. H1 (inverted-U nonlinearity: β₁ &gt; 0, β₂ &lt; 0) is grounded in the Uppsala model (Johanson &amp; Vahlne, 1977, 2009) and coordination-cost theory (Hitt et al., 1997). H2 specifies technological capability (TCI_z, Resource-Based View: Barney, 1991) as a level-shifting direct effect and secondary moderator on the FSTS–performance curve; instrument: industry-level TCI mean (causal IV identification). H4 treats website-based digital adoption (DAI_z, Tier-1 only) as an exploratory probe of the Digital Capability Lens (Banalieva &amp; Dhanaraj, 2019); measurement constraint acknowledged — single binary indicator across 2009/2015/2023 waves limits inferential strength. (+) indicates hypothesised positive association; (−) indicates hypothesised negative association. Control variables (ln firm size, firm age, foreign ownership, broad-sector fixed effects, wave fixed effects) enter additively in all models but are omitted from the figure for clarity. ICRV context: Vietnam — Nhóm IV (Lower_mid_transition, ICRV Group 4 of 6; lower-middle-income transition economy; WGI Rule of Law ≈ −0.09 in 2023, World Bank). Data: WBES 2009, 2015, 2023; N = 2,958 (pooled), n_wave = 989/956/1,013.</w:t>
       </w:r>
     </w:p>
-    <w:bookmarkEnd w:id="34"/>
-    <w:bookmarkEnd w:id="35"/>
-    <w:bookmarkStart w:id="41" w:name="Xfd2f05febb90fd7f58b14547dd9b33901f267a5"/>
+    <w:bookmarkEnd w:id="37"/>
+    <w:bookmarkEnd w:id="38"/>
+    <w:bookmarkStart w:id="44" w:name="Xfd2f05febb90fd7f58b14547dd9b33901f267a5"/>
     <w:p>
       <w:pPr>
         <w:pStyle w:val="Heading2"/>
@@ -2026,7 +2065,7 @@
         <w:t xml:space="preserve">3. Data, variables, and empirical strategy</w:t>
       </w:r>
     </w:p>
-    <w:bookmarkStart w:id="36" w:name="X690a6f2a93b97075aa335e9e4cac18d5293d91d"/>
+    <w:bookmarkStart w:id="39" w:name="X690a6f2a93b97075aa335e9e4cac18d5293d91d"/>
     <w:p>
       <w:pPr>
         <w:pStyle w:val="Heading3"/>
@@ -2091,8 +2130,8 @@
         <w:t xml:space="preserve">across stages.</w:t>
       </w:r>
     </w:p>
-    <w:bookmarkEnd w:id="36"/>
-    <w:bookmarkStart w:id="37" w:name="Xbcf9f12e79107fa2c089aaf13fc6c4fb773f1c2"/>
+    <w:bookmarkEnd w:id="39"/>
+    <w:bookmarkStart w:id="40" w:name="Xbcf9f12e79107fa2c089aaf13fc6c4fb773f1c2"/>
     <w:p>
       <w:pPr>
         <w:pStyle w:val="Heading3"/>
@@ -2984,8 +3023,8 @@
         <w:t xml:space="preserve">and 2023 respectively; pooled N is 2,958.</w:t>
       </w:r>
     </w:p>
-    <w:bookmarkEnd w:id="37"/>
-    <w:bookmarkStart w:id="38" w:name="Xc5fe1f3cf583535f12a87a680dcd317400b3da2"/>
+    <w:bookmarkEnd w:id="40"/>
+    <w:bookmarkStart w:id="41" w:name="Xc5fe1f3cf583535f12a87a680dcd317400b3da2"/>
     <w:p>
       <w:pPr>
         <w:pStyle w:val="Heading3"/>
@@ -3328,8 +3367,8 @@
         <w:t xml:space="preserve">All models are estimated by OLS with HC1 heteroscedasticity-consistent standard errors. Wave fixed effects (λ_t) are included in pooled specifications only. The M0–M8 sequence is estimated wave-by-wave and jointly on the pooled three-wave file, yielding four sets of estimates (2009, 2015, 2023, pooled).</w:t>
       </w:r>
     </w:p>
-    <w:bookmarkEnd w:id="38"/>
-    <w:bookmarkStart w:id="39" w:name="Xe803d156752d85865c6c4f44f4ca9bbe59bf0f9"/>
+    <w:bookmarkEnd w:id="41"/>
+    <w:bookmarkStart w:id="42" w:name="Xe803d156752d85865c6c4f44f4ca9bbe59bf0f9"/>
     <w:p>
       <w:pPr>
         <w:pStyle w:val="Heading3"/>
@@ -3408,8 +3447,8 @@
         <w:t xml:space="preserve">The repeated-cross-section data structure (three non-overlapping surveys of different firms) precludes within-firm fixed-effects estimation; the identification strategy therefore relies on the three complementary approaches above rather than panel differencing. All inferences are described as associations with the selection-robustness caveats noted above, consistent with the inferential conventions for cross-sectional WBES data (Antonakis et al., 2010; Shaver, 2020).</w:t>
       </w:r>
     </w:p>
-    <w:bookmarkEnd w:id="39"/>
-    <w:bookmarkStart w:id="40" w:name="X976281aae9d7cc6accc3a8a15180eec1c0b7e58"/>
+    <w:bookmarkEnd w:id="42"/>
+    <w:bookmarkStart w:id="43" w:name="X976281aae9d7cc6accc3a8a15180eec1c0b7e58"/>
     <w:p>
       <w:pPr>
         <w:pStyle w:val="Heading3"/>
@@ -3482,9 +3521,9 @@
         <w:t xml:space="preserve">of associational evidence (Aguinis et al., 2021; Shaver, 2020).</w:t>
       </w:r>
     </w:p>
-    <w:bookmarkEnd w:id="40"/>
-    <w:bookmarkEnd w:id="41"/>
-    <w:bookmarkStart w:id="49" w:name="X121719332867ee227f0a04b486098cee978c6e6"/>
+    <w:bookmarkEnd w:id="43"/>
+    <w:bookmarkEnd w:id="44"/>
+    <w:bookmarkStart w:id="67" w:name="X121719332867ee227f0a04b486098cee978c6e6"/>
     <w:p>
       <w:pPr>
         <w:pStyle w:val="Heading2"/>
@@ -3549,7 +3588,7 @@
         <w:t xml:space="preserve">/ 20.55), consistent with broader Vietnamese productivity convergence over the period.</w:t>
       </w:r>
     </w:p>
-    <w:bookmarkStart w:id="43" w:name="X0cdd773083ddb6504e3d3ab10ff1c76267ec612"/>
+    <w:bookmarkStart w:id="46" w:name="X0cdd773083ddb6504e3d3ab10ff1c76267ec612"/>
     <w:p>
       <w:pPr>
         <w:pStyle w:val="Heading3"/>
@@ -4194,7 +4233,7 @@
       <w:r>
         <w:t xml:space="preserve"> </w:t>
       </w:r>
-      <w:hyperlink r:id="rId42">
+      <w:hyperlink r:id="rId45">
         <w:r>
           <w:rPr>
             <w:rStyle w:val="Hyperlink"/>
@@ -4459,8 +4498,8 @@
         <w:t xml:space="preserve">higher export intensity rather than uniformly across the export-intensity range.</w:t>
       </w:r>
     </w:p>
-    <w:bookmarkEnd w:id="43"/>
-    <w:bookmarkStart w:id="44" w:name="Xaa4851a9c1b3e08eeca0ab72ae930e2b05bff75"/>
+    <w:bookmarkEnd w:id="46"/>
+    <w:bookmarkStart w:id="59" w:name="Xaa4851a9c1b3e08eeca0ab72ae930e2b05bff75"/>
     <w:p>
       <w:pPr>
         <w:pStyle w:val="Heading3"/>
@@ -5093,7 +5132,46 @@
         <w:pStyle w:val="BodyText"/>
       </w:pPr>
       <w:r>
-        <w:t xml:space="preserve">Figure 2a: Wave 2009 — predicted ln(labour productivity) vs FSTS</w:t>
+        <w:drawing>
+          <wp:inline>
+            <wp:extent cx="5753100" cy="3835399"/>
+            <wp:effectExtent b="0" l="0" r="0" t="0"/>
+            <wp:docPr descr="Figure 2a: Wave 2009 — predicted ln(labour productivity) vs FSTS" title="" id="48" name="Picture"/>
+            <a:graphic>
+              <a:graphicData uri="http://schemas.openxmlformats.org/drawingml/2006/picture">
+                <pic:pic>
+                  <pic:nvPicPr>
+                    <pic:cNvPr descr="figures/vietnam/figure_2a.png" id="49" name="Picture"/>
+                    <pic:cNvPicPr>
+                      <a:picLocks noChangeArrowheads="1" noChangeAspect="1"/>
+                    </pic:cNvPicPr>
+                  </pic:nvPicPr>
+                  <pic:blipFill>
+                    <a:blip r:embed="rId47"/>
+                    <a:stretch>
+                      <a:fillRect/>
+                    </a:stretch>
+                  </pic:blipFill>
+                  <pic:spPr bwMode="auto">
+                    <a:xfrm>
+                      <a:off x="0" y="0"/>
+                      <a:ext cx="5753100" cy="3835399"/>
+                    </a:xfrm>
+                    <a:prstGeom prst="rect">
+                      <a:avLst/>
+                    </a:prstGeom>
+                    <a:noFill/>
+                    <a:ln w="9525">
+                      <a:noFill/>
+                      <a:headEnd/>
+                      <a:tailEnd/>
+                    </a:ln>
+                  </pic:spPr>
+                </pic:pic>
+              </a:graphicData>
+            </a:graphic>
+          </wp:inline>
+        </w:drawing>
       </w:r>
     </w:p>
     <w:p>
@@ -5119,7 +5197,46 @@
         <w:pStyle w:val="BodyText"/>
       </w:pPr>
       <w:r>
-        <w:t xml:space="preserve">Figure 2b: Wave 2015 — predicted ln(labour productivity) vs FSTS</w:t>
+        <w:drawing>
+          <wp:inline>
+            <wp:extent cx="5753100" cy="3835399"/>
+            <wp:effectExtent b="0" l="0" r="0" t="0"/>
+            <wp:docPr descr="Figure 2b: Wave 2015 — predicted ln(labour productivity) vs FSTS" title="" id="51" name="Picture"/>
+            <a:graphic>
+              <a:graphicData uri="http://schemas.openxmlformats.org/drawingml/2006/picture">
+                <pic:pic>
+                  <pic:nvPicPr>
+                    <pic:cNvPr descr="figures/vietnam/figure_2b.png" id="52" name="Picture"/>
+                    <pic:cNvPicPr>
+                      <a:picLocks noChangeArrowheads="1" noChangeAspect="1"/>
+                    </pic:cNvPicPr>
+                  </pic:nvPicPr>
+                  <pic:blipFill>
+                    <a:blip r:embed="rId50"/>
+                    <a:stretch>
+                      <a:fillRect/>
+                    </a:stretch>
+                  </pic:blipFill>
+                  <pic:spPr bwMode="auto">
+                    <a:xfrm>
+                      <a:off x="0" y="0"/>
+                      <a:ext cx="5753100" cy="3835399"/>
+                    </a:xfrm>
+                    <a:prstGeom prst="rect">
+                      <a:avLst/>
+                    </a:prstGeom>
+                    <a:noFill/>
+                    <a:ln w="9525">
+                      <a:noFill/>
+                      <a:headEnd/>
+                      <a:tailEnd/>
+                    </a:ln>
+                  </pic:spPr>
+                </pic:pic>
+              </a:graphicData>
+            </a:graphic>
+          </wp:inline>
+        </w:drawing>
       </w:r>
     </w:p>
     <w:p>
@@ -5145,7 +5262,46 @@
         <w:pStyle w:val="BodyText"/>
       </w:pPr>
       <w:r>
-        <w:t xml:space="preserve">Figure 2c: Wave 2023 — predicted ln(labour productivity) vs FSTS</w:t>
+        <w:drawing>
+          <wp:inline>
+            <wp:extent cx="5753100" cy="3835399"/>
+            <wp:effectExtent b="0" l="0" r="0" t="0"/>
+            <wp:docPr descr="Figure 2c: Wave 2023 — predicted ln(labour productivity) vs FSTS" title="" id="54" name="Picture"/>
+            <a:graphic>
+              <a:graphicData uri="http://schemas.openxmlformats.org/drawingml/2006/picture">
+                <pic:pic>
+                  <pic:nvPicPr>
+                    <pic:cNvPr descr="figures/vietnam/figure_2c.png" id="55" name="Picture"/>
+                    <pic:cNvPicPr>
+                      <a:picLocks noChangeArrowheads="1" noChangeAspect="1"/>
+                    </pic:cNvPicPr>
+                  </pic:nvPicPr>
+                  <pic:blipFill>
+                    <a:blip r:embed="rId53"/>
+                    <a:stretch>
+                      <a:fillRect/>
+                    </a:stretch>
+                  </pic:blipFill>
+                  <pic:spPr bwMode="auto">
+                    <a:xfrm>
+                      <a:off x="0" y="0"/>
+                      <a:ext cx="5753100" cy="3835399"/>
+                    </a:xfrm>
+                    <a:prstGeom prst="rect">
+                      <a:avLst/>
+                    </a:prstGeom>
+                    <a:noFill/>
+                    <a:ln w="9525">
+                      <a:noFill/>
+                      <a:headEnd/>
+                      <a:tailEnd/>
+                    </a:ln>
+                  </pic:spPr>
+                </pic:pic>
+              </a:graphicData>
+            </a:graphic>
+          </wp:inline>
+        </w:drawing>
       </w:r>
     </w:p>
     <w:p>
@@ -5171,7 +5327,46 @@
         <w:pStyle w:val="BodyText"/>
       </w:pPr>
       <w:r>
-        <w:t xml:space="preserve">Figure 2d: Pooled (2009+2015+2023) — predicted ln(labour productivity) vs FSTS</w:t>
+        <w:drawing>
+          <wp:inline>
+            <wp:extent cx="5753100" cy="3835399"/>
+            <wp:effectExtent b="0" l="0" r="0" t="0"/>
+            <wp:docPr descr="Figure 2d: Pooled (2009+2015+2023) — predicted ln(labour productivity) vs FSTS" title="" id="57" name="Picture"/>
+            <a:graphic>
+              <a:graphicData uri="http://schemas.openxmlformats.org/drawingml/2006/picture">
+                <pic:pic>
+                  <pic:nvPicPr>
+                    <pic:cNvPr descr="figures/vietnam/figure_2d.png" id="58" name="Picture"/>
+                    <pic:cNvPicPr>
+                      <a:picLocks noChangeArrowheads="1" noChangeAspect="1"/>
+                    </pic:cNvPicPr>
+                  </pic:nvPicPr>
+                  <pic:blipFill>
+                    <a:blip r:embed="rId56"/>
+                    <a:stretch>
+                      <a:fillRect/>
+                    </a:stretch>
+                  </pic:blipFill>
+                  <pic:spPr bwMode="auto">
+                    <a:xfrm>
+                      <a:off x="0" y="0"/>
+                      <a:ext cx="5753100" cy="3835399"/>
+                    </a:xfrm>
+                    <a:prstGeom prst="rect">
+                      <a:avLst/>
+                    </a:prstGeom>
+                    <a:noFill/>
+                    <a:ln w="9525">
+                      <a:noFill/>
+                      <a:headEnd/>
+                      <a:tailEnd/>
+                    </a:ln>
+                  </pic:spPr>
+                </pic:pic>
+              </a:graphicData>
+            </a:graphic>
+          </wp:inline>
+        </w:drawing>
       </w:r>
     </w:p>
     <w:p>
@@ -5192,8 +5387,8 @@
         <w:t xml:space="preserve">Predicted ln(labour productivity) as a function of FSTS for the pooled sample (M2). Turning point ≈ 40% FSTS (Lind-Mehlum p &lt; .001).</w:t>
       </w:r>
     </w:p>
-    <w:bookmarkEnd w:id="44"/>
-    <w:bookmarkStart w:id="45" w:name="X41c3dce096fbfa1c0be6a58d0741b2aa56fb860"/>
+    <w:bookmarkEnd w:id="59"/>
+    <w:bookmarkStart w:id="63" w:name="X41c3dce096fbfa1c0be6a58d0741b2aa56fb860"/>
     <w:p>
       <w:pPr>
         <w:pStyle w:val="Heading3"/>
@@ -5347,7 +5542,46 @@
         <w:pStyle w:val="BodyText"/>
       </w:pPr>
       <w:r>
-        <w:t xml:space="preserve">Figure 3: Moderator marginal effects — TCI and DAI interactions with FSTS (Vietnam)</w:t>
+        <w:drawing>
+          <wp:inline>
+            <wp:extent cx="5753100" cy="2401293"/>
+            <wp:effectExtent b="0" l="0" r="0" t="0"/>
+            <wp:docPr descr="Figure 3: Moderator marginal effects — TCI and DAI interactions with FSTS (Vietnam)" title="" id="61" name="Picture"/>
+            <a:graphic>
+              <a:graphicData uri="http://schemas.openxmlformats.org/drawingml/2006/picture">
+                <pic:pic>
+                  <pic:nvPicPr>
+                    <pic:cNvPr descr="figures/vietnam/figure_3_moderator_marginals.png" id="62" name="Picture"/>
+                    <pic:cNvPicPr>
+                      <a:picLocks noChangeArrowheads="1" noChangeAspect="1"/>
+                    </pic:cNvPicPr>
+                  </pic:nvPicPr>
+                  <pic:blipFill>
+                    <a:blip r:embed="rId60"/>
+                    <a:stretch>
+                      <a:fillRect/>
+                    </a:stretch>
+                  </pic:blipFill>
+                  <pic:spPr bwMode="auto">
+                    <a:xfrm>
+                      <a:off x="0" y="0"/>
+                      <a:ext cx="5753100" cy="2401293"/>
+                    </a:xfrm>
+                    <a:prstGeom prst="rect">
+                      <a:avLst/>
+                    </a:prstGeom>
+                    <a:noFill/>
+                    <a:ln w="9525">
+                      <a:noFill/>
+                      <a:headEnd/>
+                      <a:tailEnd/>
+                    </a:ln>
+                  </pic:spPr>
+                </pic:pic>
+              </a:graphicData>
+            </a:graphic>
+          </wp:inline>
+        </w:drawing>
       </w:r>
     </w:p>
     <w:p>
@@ -5368,8 +5602,8 @@
         <w:t xml:space="preserve">Marginal effects of TCI_z and DAI_z on ln(labour productivity) across FSTS levels (M7/M8). TCI shows a stable positive level-shift across waves; DAI moderation is wave-specific, with the 2023 interaction showing attenuation at high FSTS (Type I moderation: slope-flattening, shape preserved).</w:t>
       </w:r>
     </w:p>
-    <w:bookmarkEnd w:id="45"/>
-    <w:bookmarkStart w:id="46" w:name="X3b4c7e0874095eca8ced8b4f3eaf74e392e9461"/>
+    <w:bookmarkEnd w:id="63"/>
+    <w:bookmarkStart w:id="64" w:name="X3b4c7e0874095eca8ced8b4f3eaf74e392e9461"/>
     <w:p>
       <w:pPr>
         <w:pStyle w:val="Heading3"/>
@@ -5440,8 +5674,8 @@
         <w:t xml:space="preserve">Table 3 summarises the directional interpretation of the focal coefficients from the full specifications by wave and for the pooled sample.</w:t>
       </w:r>
     </w:p>
-    <w:bookmarkEnd w:id="46"/>
-    <w:bookmarkStart w:id="48" w:name="Xa4c02e0b9d1c1dfbd229ca8e93a765eb24721f0"/>
+    <w:bookmarkEnd w:id="64"/>
+    <w:bookmarkStart w:id="66" w:name="Xa4c02e0b9d1c1dfbd229ca8e93a765eb24721f0"/>
     <w:p>
       <w:pPr>
         <w:pStyle w:val="Heading3"/>
@@ -5722,7 +5956,7 @@
         <w:t xml:space="preserve">turning-point magnitude.</w:t>
       </w:r>
     </w:p>
-    <w:bookmarkStart w:id="47" w:name="robustness-to-endogeneity-and-selection"/>
+    <w:bookmarkStart w:id="65" w:name="robustness-to-endogeneity-and-selection"/>
     <w:p>
       <w:pPr>
         <w:pStyle w:val="Heading4"/>
@@ -17144,7 +17378,7 @@
       <w:r>
         <w:t xml:space="preserve"> </w:t>
       </w:r>
-      <w:hyperlink r:id="rId42">
+      <w:hyperlink r:id="rId45">
         <w:r>
           <w:rPr>
             <w:rStyle w:val="Hyperlink"/>
@@ -17815,10 +18049,10 @@
         <w:t xml:space="preserve">Cross-wave coefficient equality tests following Paternoster et al. (1998). Failure to reject indicates coefficient stability across waves. FSTSc and FSTSc² comparisons support wave-specific heterogeneity in TCI and DAI direct effects but not in the I–P curvature parameters. Turning points (already reported in Table 5 above) are derived from M2 (lnLP = β₀ + β₁ FSTS_c + β₂ FSTS_c² + controls + sector FE [+ wave FE in pooled]) back-transformed to the raw FSTS scale; 95% CI uses the delta method; Lind–Mehlum p-values follow the Sasabuchi-style endpoint test (Lind &amp; Mehlum, 2010). Source: WBES Vietnam 2009, 2015, 2023; authors' calculations.</w:t>
       </w:r>
     </w:p>
-    <w:bookmarkEnd w:id="47"/>
-    <w:bookmarkEnd w:id="48"/>
-    <w:bookmarkEnd w:id="49"/>
-    <w:bookmarkStart w:id="55" w:name="X735612638e4e736e4693e459c258977262c0dfc"/>
+    <w:bookmarkEnd w:id="65"/>
+    <w:bookmarkEnd w:id="66"/>
+    <w:bookmarkEnd w:id="67"/>
+    <w:bookmarkStart w:id="73" w:name="X735612638e4e736e4693e459c258977262c0dfc"/>
     <w:p>
       <w:pPr>
         <w:pStyle w:val="Heading2"/>
@@ -17835,7 +18069,7 @@
         <w:t xml:space="preserve">The results should first be located against the meta-analytic baseline. Wu, Fan, and Chen (2022, MIR) establish a positive average I–P relationship for emerging-market multinationals — a useful macro-level anchor, but one that aggregates across institutional contexts in which the functional form may vary substantially. Country-level heterogeneity in the I–P curve shape remains under-specified in that meta-analysis. Vietnam — as a single-party transitional economy with rapid but uneven digital infrastructure uptake — provides a critical test of whether the pooled meta-level estimate masks functional-form nonlinearity at the within-country level. The present evidence is consistent with that concern: the inverted-U is robust within Vietnam but is driven predominantly by a participation-margin step rather than by within-exporter saturation, a structure that pooling across exporters and non-exporters in cross-country meta-analyses would tend to inflate into an apparent continuous curvature. The within-Vietnam temporal durability of the threshold (39–46 % band sustained across 14 years) additionally confirms that institutional context — held constant in this single-country design — stabilises the curve shape in a way that cross-country designs cannot isolate. Our finding of a reproducible inverted-U at FSTS ≈ 39–46% in Vietnam, despite the cross-national skepticism articulated by Pisani, Garcia-Bernardo, and Heemskerk (2020, SMJ), is consistent with the view that single-country institutional contexts retain functional-form heterogeneity that pooled cross-national samples obscure through aggregation.</w:t>
       </w:r>
     </w:p>
-    <w:bookmarkStart w:id="50" w:name="Xa5f80b6bc0b8dd7b33d639445ac723c1ee9ad4a"/>
+    <w:bookmarkStart w:id="68" w:name="Xa5f80b6bc0b8dd7b33d639445ac723c1ee9ad4a"/>
     <w:p>
       <w:pPr>
         <w:pStyle w:val="Heading3"/>
@@ -17908,8 +18142,8 @@
         <w:t xml:space="preserve">stand in the broader trajectory of internationalisation and transition, as captured in repeated cross-sectional snapshots rather than within-firm longitudinal records.</w:t>
       </w:r>
     </w:p>
-    <w:bookmarkEnd w:id="50"/>
-    <w:bookmarkStart w:id="51" w:name="Xa30cb53845d80e9f381e97d931a6564a08369b5"/>
+    <w:bookmarkEnd w:id="68"/>
+    <w:bookmarkStart w:id="69" w:name="Xa30cb53845d80e9f381e97d931a6564a08369b5"/>
     <w:p>
       <w:pPr>
         <w:pStyle w:val="Heading3"/>
@@ -18120,8 +18354,8 @@
         <w:t xml:space="preserve">a single label.</w:t>
       </w:r>
     </w:p>
-    <w:bookmarkEnd w:id="51"/>
-    <w:bookmarkStart w:id="52" w:name="X946dfeb74c2174371e94edd51e868f8bb309c10"/>
+    <w:bookmarkEnd w:id="69"/>
+    <w:bookmarkStart w:id="70" w:name="X946dfeb74c2174371e94edd51e868f8bb309c10"/>
     <w:p>
       <w:pPr>
         <w:pStyle w:val="Heading3"/>
@@ -18424,8 +18658,8 @@
         <w:t xml:space="preserve">indistinguishable across waves.</w:t>
       </w:r>
     </w:p>
-    <w:bookmarkEnd w:id="52"/>
-    <w:bookmarkStart w:id="53" w:name="Xd9a4ebc909e2b14dcfe03b7b8686207326328b4"/>
+    <w:bookmarkEnd w:id="70"/>
+    <w:bookmarkStart w:id="71" w:name="Xd9a4ebc909e2b14dcfe03b7b8686207326328b4"/>
     <w:p>
       <w:pPr>
         <w:pStyle w:val="Heading3"/>
@@ -18544,8 +18778,8 @@
         <w:t xml:space="preserve">Two cross-cutting principles emerge. First, managers should avoid conflating basic digital adoption with deeper technological capability — the constructs do not behave identically across periods or under identification-robust estimation, and Tier-1 digital expenditure does not substitute for the foreign-technology, standards, and process-integration investments that the TCI channel reflects. Second, allocation decisions should be staged against the empirically identified thresholds rather than against generic digital-transformation prescriptions: investment in incremental Tier-1 presence at high export intensity may absorb scarce capital with limited productivity return, while investment in TCI-channel capability around the 39–46 % band corresponds to where the cross-wave evidence is most consistent with a productivity-enhancing effect. The threshold-conditioned framing translates the step-function and Tier-1 saturation findings into actionable allocation guidance without overstating the causal status of the cross-sectional coefficients.</w:t>
       </w:r>
     </w:p>
-    <w:bookmarkEnd w:id="53"/>
-    <w:bookmarkStart w:id="54" w:name="X0d482379a65faf52764848d2b168aee0725ece4"/>
+    <w:bookmarkEnd w:id="71"/>
+    <w:bookmarkStart w:id="72" w:name="X0d482379a65faf52764848d2b168aee0725ece4"/>
     <w:p>
       <w:pPr>
         <w:pStyle w:val="Heading3"/>
@@ -18708,9 +18942,9 @@
         <w:t xml:space="preserve">update identifies the cultivation of high-tech industrial talent as a binding constraint mediating digital and capability investment into sustainable productivity gains — reinforcing the argument that policy evaluation in transitional settings must monitor the capability environment, not adoption rates alone.</w:t>
       </w:r>
     </w:p>
-    <w:bookmarkEnd w:id="54"/>
-    <w:bookmarkEnd w:id="55"/>
-    <w:bookmarkStart w:id="56" w:name="Xf3d63d3bef15b3e862b66ed5bd48a577996a1bc"/>
+    <w:bookmarkEnd w:id="72"/>
+    <w:bookmarkEnd w:id="73"/>
+    <w:bookmarkStart w:id="74" w:name="Xf3d63d3bef15b3e862b66ed5bd48a577996a1bc"/>
     <w:p>
       <w:pPr>
         <w:pStyle w:val="Heading2"/>
@@ -18889,8 +19123,8 @@
         <w:t xml:space="preserve">Sixth, the analysis is limited to Vietnam as a single transitional economy at a particular stage of its digital and institutional development. Understanding how the DAI moderation pattern documented here — negative at high export intensity under Tier-1-only adoption — compares with patterns in other emerging markets at different institutional stages, or with patterns in digitally advanced economies where the same interaction is predicted to be positive, requires cross-setting comparative designs that systematically vary institutional transaction costs and digital infrastructure quality. Such designs would also allow more direct tests of the context-contingent framing developed in §2.1.</w:t>
       </w:r>
     </w:p>
-    <w:bookmarkEnd w:id="56"/>
-    <w:bookmarkStart w:id="57" w:name="X19cad7d15381a9dfa000caf49ac5c69889e188d"/>
+    <w:bookmarkEnd w:id="74"/>
+    <w:bookmarkStart w:id="75" w:name="X19cad7d15381a9dfa000caf49ac5c69889e188d"/>
     <w:p>
       <w:pPr>
         <w:pStyle w:val="Heading2"/>
@@ -18923,8 +19157,8 @@
         <w:t xml:space="preserve">The results also show that technological capability and the baseline website-presence indicator should not be treated as interchangeable, and that conflating them under a single "digital adoption" or "digital transformation" label would obscure their differing identification properties. Technological capability is comparatively stable and identification-robust across specifications. The baseline DAI_z control is more wave-sensitive and attenuates to a null under instrumental-variable estimation, consistent with Tier-1 proxy obsolescence as website ownership diffuses to near-universal levels in the Vietnamese firm population. Within the constraint of a single binary website indicator, this paper makes no claim about dynamic digital capability moderation; any such test awaits richer Tier 2–4 indicators not currently available cross-wave in the WBES Vietnam instrument.</w:t>
       </w:r>
     </w:p>
-    <w:bookmarkEnd w:id="57"/>
-    <w:bookmarkStart w:id="58" w:name="conflict-of-interest"/>
+    <w:bookmarkEnd w:id="75"/>
+    <w:bookmarkStart w:id="76" w:name="conflict-of-interest"/>
     <w:p>
       <w:pPr>
         <w:pStyle w:val="Heading2"/>
@@ -18941,8 +19175,8 @@
         <w:t xml:space="preserve">The authors declare no conflict of interest.</w:t>
       </w:r>
     </w:p>
-    <w:bookmarkEnd w:id="58"/>
-    <w:bookmarkStart w:id="59" w:name="funding"/>
+    <w:bookmarkEnd w:id="76"/>
+    <w:bookmarkStart w:id="77" w:name="funding"/>
     <w:p>
       <w:pPr>
         <w:pStyle w:val="Heading2"/>
@@ -18965,8 +19199,8 @@
         <w:t xml:space="preserve">not-for-profit sectors.</w:t>
       </w:r>
     </w:p>
-    <w:bookmarkEnd w:id="59"/>
-    <w:bookmarkStart w:id="60" w:name="data-availability-statement"/>
+    <w:bookmarkEnd w:id="77"/>
+    <w:bookmarkStart w:id="78" w:name="data-availability-statement"/>
     <w:p>
       <w:pPr>
         <w:pStyle w:val="Heading2"/>
@@ -19013,8 +19247,8 @@
         <w:t xml:space="preserve">and may be shared to the extent permitted by the data-access terms.</w:t>
       </w:r>
     </w:p>
-    <w:bookmarkEnd w:id="60"/>
-    <w:bookmarkStart w:id="61" w:name="X799c23334c5944d058eaf15944a1408ff96b683"/>
+    <w:bookmarkEnd w:id="78"/>
+    <w:bookmarkStart w:id="79" w:name="X799c23334c5944d058eaf15944a1408ff96b683"/>
     <w:p>
       <w:pPr>
         <w:pStyle w:val="Heading2"/>
@@ -19065,8 +19299,8 @@
         <w:t xml:space="preserve">publication.</w:t>
       </w:r>
     </w:p>
-    <w:bookmarkEnd w:id="61"/>
-    <w:bookmarkStart w:id="62" w:name="acknowledgements"/>
+    <w:bookmarkEnd w:id="79"/>
+    <w:bookmarkStart w:id="80" w:name="acknowledgements"/>
     <w:p>
       <w:pPr>
         <w:pStyle w:val="Heading2"/>
@@ -19145,8 +19379,8 @@
         <w:t xml:space="preserve">and computational reproducibility.</w:t>
       </w:r>
     </w:p>
-    <w:bookmarkEnd w:id="62"/>
-    <w:bookmarkStart w:id="63" w:name="supplementary-materials"/>
+    <w:bookmarkEnd w:id="80"/>
+    <w:bookmarkStart w:id="81" w:name="supplementary-materials"/>
     <w:p>
       <w:pPr>
         <w:pStyle w:val="Heading2"/>
@@ -19198,8 +19432,8 @@
         </w:pict>
       </w:r>
     </w:p>
-    <w:bookmarkEnd w:id="63"/>
-    <w:bookmarkStart w:id="113" w:name="references"/>
+    <w:bookmarkEnd w:id="81"/>
+    <w:bookmarkStart w:id="131" w:name="references"/>
     <w:p>
       <w:pPr>
         <w:pStyle w:val="Heading2"/>
@@ -19231,7 +19465,7 @@
       <w:r>
         <w:t xml:space="preserve"> </w:t>
       </w:r>
-      <w:hyperlink r:id="rId64">
+      <w:hyperlink r:id="rId82">
         <w:r>
           <w:rPr>
             <w:rStyle w:val="Hyperlink"/>
@@ -19261,7 +19495,7 @@
       <w:r>
         <w:t xml:space="preserve"> </w:t>
       </w:r>
-      <w:hyperlink r:id="rId65">
+      <w:hyperlink r:id="rId83">
         <w:r>
           <w:rPr>
             <w:rStyle w:val="Hyperlink"/>
@@ -19291,7 +19525,7 @@
       <w:r>
         <w:t xml:space="preserve"> </w:t>
       </w:r>
-      <w:hyperlink r:id="rId66">
+      <w:hyperlink r:id="rId84">
         <w:r>
           <w:rPr>
             <w:rStyle w:val="Hyperlink"/>
@@ -19321,7 +19555,7 @@
       <w:r>
         <w:t xml:space="preserve"> </w:t>
       </w:r>
-      <w:hyperlink r:id="rId67">
+      <w:hyperlink r:id="rId85">
         <w:r>
           <w:rPr>
             <w:rStyle w:val="Hyperlink"/>
@@ -19351,7 +19585,7 @@
       <w:r>
         <w:t xml:space="preserve"> </w:t>
       </w:r>
-      <w:hyperlink r:id="rId68">
+      <w:hyperlink r:id="rId86">
         <w:r>
           <w:rPr>
             <w:rStyle w:val="Hyperlink"/>
@@ -19381,7 +19615,7 @@
       <w:r>
         <w:t xml:space="preserve"> </w:t>
       </w:r>
-      <w:hyperlink r:id="rId69">
+      <w:hyperlink r:id="rId87">
         <w:r>
           <w:rPr>
             <w:rStyle w:val="Hyperlink"/>
@@ -19411,7 +19645,7 @@
       <w:r>
         <w:t xml:space="preserve"> </w:t>
       </w:r>
-      <w:hyperlink r:id="rId70">
+      <w:hyperlink r:id="rId88">
         <w:r>
           <w:rPr>
             <w:rStyle w:val="Hyperlink"/>
@@ -19441,7 +19675,7 @@
       <w:r>
         <w:t xml:space="preserve"> </w:t>
       </w:r>
-      <w:hyperlink r:id="rId71">
+      <w:hyperlink r:id="rId89">
         <w:r>
           <w:rPr>
             <w:rStyle w:val="Hyperlink"/>
@@ -19471,7 +19705,7 @@
       <w:r>
         <w:t xml:space="preserve"> </w:t>
       </w:r>
-      <w:hyperlink r:id="rId72">
+      <w:hyperlink r:id="rId90">
         <w:r>
           <w:rPr>
             <w:rStyle w:val="Hyperlink"/>
@@ -19501,7 +19735,7 @@
       <w:r>
         <w:t xml:space="preserve"> </w:t>
       </w:r>
-      <w:hyperlink r:id="rId73">
+      <w:hyperlink r:id="rId91">
         <w:r>
           <w:rPr>
             <w:rStyle w:val="Hyperlink"/>
@@ -19531,7 +19765,7 @@
       <w:r>
         <w:t xml:space="preserve"> </w:t>
       </w:r>
-      <w:hyperlink r:id="rId74">
+      <w:hyperlink r:id="rId92">
         <w:r>
           <w:rPr>
             <w:rStyle w:val="Hyperlink"/>
@@ -19561,7 +19795,7 @@
       <w:r>
         <w:t xml:space="preserve"> </w:t>
       </w:r>
-      <w:hyperlink r:id="rId75">
+      <w:hyperlink r:id="rId93">
         <w:r>
           <w:rPr>
             <w:rStyle w:val="Hyperlink"/>
@@ -19591,7 +19825,7 @@
       <w:r>
         <w:t xml:space="preserve"> </w:t>
       </w:r>
-      <w:hyperlink r:id="rId76">
+      <w:hyperlink r:id="rId94">
         <w:r>
           <w:rPr>
             <w:rStyle w:val="Hyperlink"/>
@@ -19621,7 +19855,7 @@
       <w:r>
         <w:t xml:space="preserve"> </w:t>
       </w:r>
-      <w:hyperlink r:id="rId77">
+      <w:hyperlink r:id="rId95">
         <w:r>
           <w:rPr>
             <w:rStyle w:val="Hyperlink"/>
@@ -19633,7 +19867,7 @@
         <w:t xml:space="preserve"> </w:t>
       </w:r>
       <w:r>
-        <w:t xml:space="preserve">Haans, R. F. J., Pieters, C., &amp; He, Z.-L. (2016). Thinking about U: Theorizing and testing U- and inverted-U-shaped relationships in strategy research.</w:t>
+        <w:t xml:space="preserve">Haans, R. F. J., Pieters, C., &amp; He, Z.-L. (2016). Thinking about U: Theorizing and testing U- and inverted U-shaped relationships in strategy research.</w:t>
       </w:r>
       <w:r>
         <w:t xml:space="preserve"> </w:t>
@@ -19651,7 +19885,7 @@
       <w:r>
         <w:t xml:space="preserve"> </w:t>
       </w:r>
-      <w:hyperlink r:id="rId78">
+      <w:hyperlink r:id="rId96">
         <w:r>
           <w:rPr>
             <w:rStyle w:val="Hyperlink"/>
@@ -19681,7 +19915,7 @@
       <w:r>
         <w:t xml:space="preserve"> </w:t>
       </w:r>
-      <w:hyperlink r:id="rId79">
+      <w:hyperlink r:id="rId97">
         <w:r>
           <w:rPr>
             <w:rStyle w:val="Hyperlink"/>
@@ -19711,7 +19945,7 @@
       <w:r>
         <w:t xml:space="preserve"> </w:t>
       </w:r>
-      <w:hyperlink r:id="rId80">
+      <w:hyperlink r:id="rId98">
         <w:r>
           <w:rPr>
             <w:rStyle w:val="Hyperlink"/>
@@ -19741,7 +19975,7 @@
       <w:r>
         <w:t xml:space="preserve"> </w:t>
       </w:r>
-      <w:hyperlink r:id="rId81">
+      <w:hyperlink r:id="rId99">
         <w:r>
           <w:rPr>
             <w:rStyle w:val="Hyperlink"/>
@@ -19771,7 +20005,7 @@
       <w:r>
         <w:t xml:space="preserve"> </w:t>
       </w:r>
-      <w:hyperlink r:id="rId82">
+      <w:hyperlink r:id="rId100">
         <w:r>
           <w:rPr>
             <w:rStyle w:val="Hyperlink"/>
@@ -19804,7 +20038,7 @@
       <w:r>
         <w:t xml:space="preserve"> </w:t>
       </w:r>
-      <w:hyperlink r:id="rId83">
+      <w:hyperlink r:id="rId101">
         <w:r>
           <w:rPr>
             <w:rStyle w:val="Hyperlink"/>
@@ -19834,7 +20068,7 @@
       <w:r>
         <w:t xml:space="preserve"> </w:t>
       </w:r>
-      <w:hyperlink r:id="rId84">
+      <w:hyperlink r:id="rId102">
         <w:r>
           <w:rPr>
             <w:rStyle w:val="Hyperlink"/>
@@ -19864,7 +20098,7 @@
       <w:r>
         <w:t xml:space="preserve"> </w:t>
       </w:r>
-      <w:hyperlink r:id="rId85">
+      <w:hyperlink r:id="rId103">
         <w:r>
           <w:rPr>
             <w:rStyle w:val="Hyperlink"/>
@@ -19894,7 +20128,7 @@
       <w:r>
         <w:t xml:space="preserve"> </w:t>
       </w:r>
-      <w:hyperlink r:id="rId86">
+      <w:hyperlink r:id="rId104">
         <w:r>
           <w:rPr>
             <w:rStyle w:val="Hyperlink"/>
@@ -19924,7 +20158,7 @@
       <w:r>
         <w:t xml:space="preserve"> </w:t>
       </w:r>
-      <w:hyperlink r:id="rId87">
+      <w:hyperlink r:id="rId105">
         <w:r>
           <w:rPr>
             <w:rStyle w:val="Hyperlink"/>
@@ -19954,7 +20188,7 @@
       <w:r>
         <w:t xml:space="preserve"> </w:t>
       </w:r>
-      <w:hyperlink r:id="rId88">
+      <w:hyperlink r:id="rId106">
         <w:r>
           <w:rPr>
             <w:rStyle w:val="Hyperlink"/>
@@ -19984,7 +20218,7 @@
       <w:r>
         <w:t xml:space="preserve"> </w:t>
       </w:r>
-      <w:hyperlink r:id="rId89">
+      <w:hyperlink r:id="rId107">
         <w:r>
           <w:rPr>
             <w:rStyle w:val="Hyperlink"/>
@@ -20014,7 +20248,7 @@
       <w:r>
         <w:t xml:space="preserve"> </w:t>
       </w:r>
-      <w:hyperlink r:id="rId90">
+      <w:hyperlink r:id="rId108">
         <w:r>
           <w:rPr>
             <w:rStyle w:val="Hyperlink"/>
@@ -20044,7 +20278,7 @@
       <w:r>
         <w:t xml:space="preserve"> </w:t>
       </w:r>
-      <w:hyperlink r:id="rId91">
+      <w:hyperlink r:id="rId109">
         <w:r>
           <w:rPr>
             <w:rStyle w:val="Hyperlink"/>
@@ -20074,7 +20308,7 @@
       <w:r>
         <w:t xml:space="preserve"> </w:t>
       </w:r>
-      <w:hyperlink r:id="rId92">
+      <w:hyperlink r:id="rId110">
         <w:r>
           <w:rPr>
             <w:rStyle w:val="Hyperlink"/>
@@ -20104,7 +20338,7 @@
       <w:r>
         <w:t xml:space="preserve"> </w:t>
       </w:r>
-      <w:hyperlink r:id="rId93">
+      <w:hyperlink r:id="rId111">
         <w:r>
           <w:rPr>
             <w:rStyle w:val="Hyperlink"/>
@@ -20134,7 +20368,7 @@
       <w:r>
         <w:t xml:space="preserve"> </w:t>
       </w:r>
-      <w:hyperlink r:id="rId94">
+      <w:hyperlink r:id="rId112">
         <w:r>
           <w:rPr>
             <w:rStyle w:val="Hyperlink"/>
@@ -20167,7 +20401,7 @@
       <w:r>
         <w:t xml:space="preserve"> </w:t>
       </w:r>
-      <w:hyperlink r:id="rId95">
+      <w:hyperlink r:id="rId113">
         <w:r>
           <w:rPr>
             <w:rStyle w:val="Hyperlink"/>
@@ -20197,7 +20431,7 @@
       <w:r>
         <w:t xml:space="preserve"> </w:t>
       </w:r>
-      <w:hyperlink r:id="rId96">
+      <w:hyperlink r:id="rId114">
         <w:r>
           <w:rPr>
             <w:rStyle w:val="Hyperlink"/>
@@ -20227,7 +20461,7 @@
       <w:r>
         <w:t xml:space="preserve"> </w:t>
       </w:r>
-      <w:hyperlink r:id="rId97">
+      <w:hyperlink r:id="rId115">
         <w:r>
           <w:rPr>
             <w:rStyle w:val="Hyperlink"/>
@@ -20257,7 +20491,7 @@
       <w:r>
         <w:t xml:space="preserve"> </w:t>
       </w:r>
-      <w:hyperlink r:id="rId98">
+      <w:hyperlink r:id="rId116">
         <w:r>
           <w:rPr>
             <w:rStyle w:val="Hyperlink"/>
@@ -20287,7 +20521,7 @@
       <w:r>
         <w:t xml:space="preserve"> </w:t>
       </w:r>
-      <w:hyperlink r:id="rId99">
+      <w:hyperlink r:id="rId117">
         <w:r>
           <w:rPr>
             <w:rStyle w:val="Hyperlink"/>
@@ -20317,7 +20551,7 @@
       <w:r>
         <w:t xml:space="preserve"> </w:t>
       </w:r>
-      <w:hyperlink r:id="rId100">
+      <w:hyperlink r:id="rId118">
         <w:r>
           <w:rPr>
             <w:rStyle w:val="Hyperlink"/>
@@ -20347,7 +20581,7 @@
       <w:r>
         <w:t xml:space="preserve"> </w:t>
       </w:r>
-      <w:hyperlink r:id="rId101">
+      <w:hyperlink r:id="rId119">
         <w:r>
           <w:rPr>
             <w:rStyle w:val="Hyperlink"/>
@@ -20377,7 +20611,7 @@
       <w:r>
         <w:t xml:space="preserve"> </w:t>
       </w:r>
-      <w:hyperlink r:id="rId102">
+      <w:hyperlink r:id="rId120">
         <w:r>
           <w:rPr>
             <w:rStyle w:val="Hyperlink"/>
@@ -20407,7 +20641,7 @@
       <w:r>
         <w:t xml:space="preserve"> </w:t>
       </w:r>
-      <w:hyperlink r:id="rId103">
+      <w:hyperlink r:id="rId121">
         <w:r>
           <w:rPr>
             <w:rStyle w:val="Hyperlink"/>
@@ -20437,7 +20671,7 @@
       <w:r>
         <w:t xml:space="preserve"> </w:t>
       </w:r>
-      <w:hyperlink r:id="rId104">
+      <w:hyperlink r:id="rId122">
         <w:r>
           <w:rPr>
             <w:rStyle w:val="Hyperlink"/>
@@ -20467,7 +20701,7 @@
       <w:r>
         <w:t xml:space="preserve"> </w:t>
       </w:r>
-      <w:hyperlink r:id="rId105">
+      <w:hyperlink r:id="rId123">
         <w:r>
           <w:rPr>
             <w:rStyle w:val="Hyperlink"/>
@@ -20497,7 +20731,7 @@
       <w:r>
         <w:t xml:space="preserve"> </w:t>
       </w:r>
-      <w:hyperlink r:id="rId106">
+      <w:hyperlink r:id="rId124">
         <w:r>
           <w:rPr>
             <w:rStyle w:val="Hyperlink"/>
@@ -20546,7 +20780,7 @@
       <w:r>
         <w:t xml:space="preserve"> </w:t>
       </w:r>
-      <w:hyperlink r:id="rId107">
+      <w:hyperlink r:id="rId125">
         <w:r>
           <w:rPr>
             <w:rStyle w:val="Hyperlink"/>
@@ -20598,7 +20832,7 @@
       <w:r>
         <w:t xml:space="preserve"> </w:t>
       </w:r>
-      <w:hyperlink r:id="rId108">
+      <w:hyperlink r:id="rId126">
         <w:r>
           <w:rPr>
             <w:rStyle w:val="Hyperlink"/>
@@ -20628,7 +20862,7 @@
       <w:r>
         <w:t xml:space="preserve"> </w:t>
       </w:r>
-      <w:hyperlink r:id="rId108">
+      <w:hyperlink r:id="rId126">
         <w:r>
           <w:rPr>
             <w:rStyle w:val="Hyperlink"/>
@@ -20658,7 +20892,7 @@
       <w:r>
         <w:t xml:space="preserve"> </w:t>
       </w:r>
-      <w:hyperlink r:id="rId108">
+      <w:hyperlink r:id="rId126">
         <w:r>
           <w:rPr>
             <w:rStyle w:val="Hyperlink"/>
@@ -20691,7 +20925,7 @@
       <w:r>
         <w:t xml:space="preserve"> </w:t>
       </w:r>
-      <w:hyperlink r:id="rId109">
+      <w:hyperlink r:id="rId127">
         <w:r>
           <w:rPr>
             <w:rStyle w:val="Hyperlink"/>
@@ -20721,7 +20955,7 @@
       <w:r>
         <w:t xml:space="preserve"> </w:t>
       </w:r>
-      <w:hyperlink r:id="rId110">
+      <w:hyperlink r:id="rId128">
         <w:r>
           <w:rPr>
             <w:rStyle w:val="Hyperlink"/>
@@ -20751,7 +20985,7 @@
       <w:r>
         <w:t xml:space="preserve"> </w:t>
       </w:r>
-      <w:hyperlink r:id="rId111">
+      <w:hyperlink r:id="rId129">
         <w:r>
           <w:rPr>
             <w:rStyle w:val="Hyperlink"/>
@@ -20781,7 +21015,7 @@
       <w:r>
         <w:t xml:space="preserve"> </w:t>
       </w:r>
-      <w:hyperlink r:id="rId112">
+      <w:hyperlink r:id="rId130">
         <w:r>
           <w:rPr>
             <w:rStyle w:val="Hyperlink"/>
@@ -20790,8 +21024,8 @@
         </w:r>
       </w:hyperlink>
     </w:p>
-    <w:bookmarkEnd w:id="113"/>
-    <w:bookmarkEnd w:id="114"/>
+    <w:bookmarkEnd w:id="131"/>
+    <w:bookmarkEnd w:id="132"/>
     <w:sectPr>
       <w:pgSz w:h="16838" w:w="11906"/>
       <w:pgMar w:bottom="1417" w:left="1417" w:right="1417" w:top="1417"/>

</xml_diff>

<commit_message>
build(p3,p4): rebuild dist docx, blinded submissions, source_md after language fixes
P3: dist/p3_vietnam_en_clean.docx, p3/submission/jabs_package/01_manuscript_blinded.docx,
    dist/source_md/p3_vietnam_en_clean.md
P4: dist/p4_singapore_en_clean.docx, p4/submission/mir_package/01_manuscript_blinded.docx,
    dist/source_md/p4_singapore_en_clean.md

Built from commit b6ddb3b (confirm→indicate L544/L639; show→document L35; indicating→suggesting L146).

https://claude.ai/code/session_01GMFmEtt6FYiJ4MKzBNCLqb
</commit_message>
<xml_diff>
--- a/dist/manuscripts/en/p3_vietnam_en_clean.docx
+++ b/dist/manuscripts/en/p3_vietnam_en_clean.docx
@@ -4344,7 +4344,7 @@
         <w:t xml:space="preserve"> </w:t>
       </w:r>
       <w:r>
-        <w:t xml:space="preserve">The Paternoster cross-wave z-tests reported in 4.5 confirm that the 2009-to-2015 fall in DAI</w:t>
+        <w:t xml:space="preserve">The Paternoster cross-wave z-tests reported in §4.5 indicate that the 2009-to-2015 fall in DAI</w:t>
       </w:r>
       <w:r>
         <w:t xml:space="preserve"> </w:t>
@@ -5265,7 +5265,7 @@
         <w:pStyle w:val="BodyText"/>
       </w:pPr>
       <w:r>
-        <w:t xml:space="preserve">H2 is supported: the positive TCI_z direct coefficient (pooled β = 0.179, p &lt; .001) is statistically significant in all three wave-specific periods (2009 p &lt; .001; 2015 p = .010; 2023 p = .006), and statistically distinguishable TCI moderation appears in three of four panels (M3 joint p = .040, .713, .027 and .003). The baseline DAI_z control reports a positive pooled level association (β = 0.078, p = .004) but with substantial wave-to-wave variability — strong in 2009 (β = 0.175, p &lt; .001), null in 2015 (β = -0.044, p = .377), and re-emerging in 2023 (β = 0.095, p = .038). Because DAI_z indexes only Tier-1 website presence and is not formalised as a primary hypothesis in this paper, this wave variation is reported descriptively rather than as a hypothesis test. The Paternoster cross-wave z-tests (4.5, Panel F) confirm that the 2009-to-2015 fall (z = 3.353, p &lt; .001) and the 2015-to-2023 recovery (z = -2.051, p = .040) are both statistically distinguishable shifts in the descriptive Tier-1 series.</w:t>
+        <w:t xml:space="preserve">H2 is supported: the positive TCI_z direct coefficient (pooled β = 0.179, p &lt; .001) is statistically significant in all three wave-specific periods (2009 p &lt; .001; 2015 p = .010; 2023 p = .006), and statistically distinguishable TCI moderation appears in three of four panels (M3 joint p = .040, .713, .027 and .003). The baseline DAI_z control reports a positive pooled level association (β = 0.078, p = .004) but with substantial wave-to-wave variability — strong in 2009 (β = 0.175, p &lt; .001), null in 2015 (β = -0.044, p = .377), and re-emerging in 2023 (β = 0.095, p = .038). Because DAI_z indexes only Tier-1 website presence and is not formalised as a primary hypothesis in this paper, this wave variation is reported descriptively rather than as a hypothesis test. The Paternoster cross-wave z-tests (§4.5, Panel F) indicate that the 2009-to-2015 fall (z = 3.353, p &lt; .001) and the 2015-to-2023 recovery (z = -2.051, p = .040) are both statistically distinguishable shifts in the descriptive Tier-1 series.</w:t>
       </w:r>
       <w:r>
         <w:t xml:space="preserve"> </w:t>

</xml_diff>

<commit_message>
style(p3,p5): normalize p-value notation within each paper (academic-variable-formatter)
Within-paper consistency audit (Scopus/WoS academic-variable-formatter skill),
respecting each journal's house style:
- P3, P5, and the P3 JED package each predominantly use APA no-leading-zero
  p-values (.xxx); normalized the stragglers (p = 0.xxx -> p = .xxx): P3 12,
  P5 4, JED 12 occurrences. z-statistics retain leading zeros (can exceed 1).
- Verified beta/squared 'mixing' is the legitimate prose-vs-LaTeX-math split
  (Unicode beta/squared in prose/tables, \beta/^2 inside display equations) and
  left unchanged. P4/P6/P7/P8/P9/P10/JED-IJOEM already consistent.
- Vietnamese chapters/chuyen-de correctly use Vietnamese number convention
  (decimal comma, leading zeros) and were left as-is.

No coefficients altered; only p-value leading-zero presentation.
</commit_message>
<xml_diff>
--- a/dist/manuscripts/en/p3_vietnam_en_clean.docx
+++ b/dist/manuscripts/en/p3_vietnam_en_clean.docx
@@ -28048,43 +28048,43 @@
               <w:jc w:val="left"/>
             </w:pPr>
             <w:r>
-              <w:t xml:space="preserve">z=-0.61 (p=0.543)</w:t>
-            </w:r>
-          </w:p>
-        </w:tc>
-        <w:tc>
-          <w:tcPr/>
-          <w:p>
-            <w:pPr>
-              <w:pStyle w:val="Compact"/>
-              <w:jc w:val="left"/>
-            </w:pPr>
-            <w:r>
-              <w:t xml:space="preserve">z=0.96 (p=0.337)</w:t>
-            </w:r>
-          </w:p>
-        </w:tc>
-        <w:tc>
-          <w:tcPr/>
-          <w:p>
-            <w:pPr>
-              <w:pStyle w:val="Compact"/>
-              <w:jc w:val="left"/>
-            </w:pPr>
-            <w:r>
-              <w:t xml:space="preserve">z=1.29 (p=0.198)</w:t>
-            </w:r>
-          </w:p>
-        </w:tc>
-        <w:tc>
-          <w:tcPr/>
-          <w:p>
-            <w:pPr>
-              <w:pStyle w:val="Compact"/>
-              <w:jc w:val="left"/>
-            </w:pPr>
-            <w:r>
-              <w:t xml:space="preserve">z=3.35 (p=0.001)</w:t>
+              <w:t xml:space="preserve">z=-0.61 (p=.543)</w:t>
+            </w:r>
+          </w:p>
+        </w:tc>
+        <w:tc>
+          <w:tcPr/>
+          <w:p>
+            <w:pPr>
+              <w:pStyle w:val="Compact"/>
+              <w:jc w:val="left"/>
+            </w:pPr>
+            <w:r>
+              <w:t xml:space="preserve">z=0.96 (p=.337)</w:t>
+            </w:r>
+          </w:p>
+        </w:tc>
+        <w:tc>
+          <w:tcPr/>
+          <w:p>
+            <w:pPr>
+              <w:pStyle w:val="Compact"/>
+              <w:jc w:val="left"/>
+            </w:pPr>
+            <w:r>
+              <w:t xml:space="preserve">z=1.29 (p=.198)</w:t>
+            </w:r>
+          </w:p>
+        </w:tc>
+        <w:tc>
+          <w:tcPr/>
+          <w:p>
+            <w:pPr>
+              <w:pStyle w:val="Compact"/>
+              <w:jc w:val="left"/>
+            </w:pPr>
+            <w:r>
+              <w:t xml:space="preserve">z=3.35 (p=.001)</w:t>
             </w:r>
           </w:p>
         </w:tc>
@@ -28110,43 +28110,43 @@
               <w:jc w:val="left"/>
             </w:pPr>
             <w:r>
-              <w:t xml:space="preserve">z=0.09 (p=0.926)</w:t>
-            </w:r>
-          </w:p>
-        </w:tc>
-        <w:tc>
-          <w:tcPr/>
-          <w:p>
-            <w:pPr>
-              <w:pStyle w:val="Compact"/>
-              <w:jc w:val="left"/>
-            </w:pPr>
-            <w:r>
-              <w:t xml:space="preserve">z=0.14 (p=0.888)</w:t>
-            </w:r>
-          </w:p>
-        </w:tc>
-        <w:tc>
-          <w:tcPr/>
-          <w:p>
-            <w:pPr>
-              <w:pStyle w:val="Compact"/>
-              <w:jc w:val="left"/>
-            </w:pPr>
-            <w:r>
-              <w:t xml:space="preserve">z=1.42 (p=0.155)</w:t>
-            </w:r>
-          </w:p>
-        </w:tc>
-        <w:tc>
-          <w:tcPr/>
-          <w:p>
-            <w:pPr>
-              <w:pStyle w:val="Compact"/>
-              <w:jc w:val="left"/>
-            </w:pPr>
-            <w:r>
-              <w:t xml:space="preserve">z=1.28 (p=0.201)</w:t>
+              <w:t xml:space="preserve">z=0.09 (p=.926)</w:t>
+            </w:r>
+          </w:p>
+        </w:tc>
+        <w:tc>
+          <w:tcPr/>
+          <w:p>
+            <w:pPr>
+              <w:pStyle w:val="Compact"/>
+              <w:jc w:val="left"/>
+            </w:pPr>
+            <w:r>
+              <w:t xml:space="preserve">z=0.14 (p=.888)</w:t>
+            </w:r>
+          </w:p>
+        </w:tc>
+        <w:tc>
+          <w:tcPr/>
+          <w:p>
+            <w:pPr>
+              <w:pStyle w:val="Compact"/>
+              <w:jc w:val="left"/>
+            </w:pPr>
+            <w:r>
+              <w:t xml:space="preserve">z=1.42 (p=.155)</w:t>
+            </w:r>
+          </w:p>
+        </w:tc>
+        <w:tc>
+          <w:tcPr/>
+          <w:p>
+            <w:pPr>
+              <w:pStyle w:val="Compact"/>
+              <w:jc w:val="left"/>
+            </w:pPr>
+            <w:r>
+              <w:t xml:space="preserve">z=1.28 (p=.201)</w:t>
             </w:r>
           </w:p>
         </w:tc>
@@ -28172,43 +28172,43 @@
               <w:jc w:val="left"/>
             </w:pPr>
             <w:r>
-              <w:t xml:space="preserve">z=0.66 (p=0.509)</w:t>
-            </w:r>
-          </w:p>
-        </w:tc>
-        <w:tc>
-          <w:tcPr/>
-          <w:p>
-            <w:pPr>
-              <w:pStyle w:val="Compact"/>
-              <w:jc w:val="left"/>
-            </w:pPr>
-            <w:r>
-              <w:t xml:space="preserve">z=-0.84 (p=0.400)</w:t>
-            </w:r>
-          </w:p>
-        </w:tc>
-        <w:tc>
-          <w:tcPr/>
-          <w:p>
-            <w:pPr>
-              <w:pStyle w:val="Compact"/>
-              <w:jc w:val="left"/>
-            </w:pPr>
-            <w:r>
-              <w:t xml:space="preserve">z=0.07 (p=0.947)</w:t>
-            </w:r>
-          </w:p>
-        </w:tc>
-        <w:tc>
-          <w:tcPr/>
-          <w:p>
-            <w:pPr>
-              <w:pStyle w:val="Compact"/>
-              <w:jc w:val="left"/>
-            </w:pPr>
-            <w:r>
-              <w:t xml:space="preserve">z=-2.05 (p=0.040)</w:t>
+              <w:t xml:space="preserve">z=0.66 (p=.509)</w:t>
+            </w:r>
+          </w:p>
+        </w:tc>
+        <w:tc>
+          <w:tcPr/>
+          <w:p>
+            <w:pPr>
+              <w:pStyle w:val="Compact"/>
+              <w:jc w:val="left"/>
+            </w:pPr>
+            <w:r>
+              <w:t xml:space="preserve">z=-0.84 (p=.400)</w:t>
+            </w:r>
+          </w:p>
+        </w:tc>
+        <w:tc>
+          <w:tcPr/>
+          <w:p>
+            <w:pPr>
+              <w:pStyle w:val="Compact"/>
+              <w:jc w:val="left"/>
+            </w:pPr>
+            <w:r>
+              <w:t xml:space="preserve">z=0.07 (p=.947)</w:t>
+            </w:r>
+          </w:p>
+        </w:tc>
+        <w:tc>
+          <w:tcPr/>
+          <w:p>
+            <w:pPr>
+              <w:pStyle w:val="Compact"/>
+              <w:jc w:val="left"/>
+            </w:pPr>
+            <w:r>
+              <w:t xml:space="preserve">z=-2.05 (p=.040)</w:t>
             </w:r>
           </w:p>
         </w:tc>

</xml_diff>